<commit_message>
update word doc on methyl mercury
</commit_message>
<xml_diff>
--- a/data/mercury_and_methylmercury_documentation.docx
+++ b/data/mercury_and_methylmercury_documentation.docx
@@ -14,7 +14,19 @@
         <w:rPr>
           <w:color w:val="000000" w:themeColor="text1"/>
         </w:rPr>
-        <w:t>Mercury and methylmercury</w:t>
+        <w:t xml:space="preserve">Mercury and </w:t>
+      </w:r>
+      <w:r>
+        <w:rPr>
+          <w:color w:val="000000" w:themeColor="text1"/>
+        </w:rPr>
+        <w:t>M</w:t>
+      </w:r>
+      <w:r>
+        <w:rPr>
+          <w:color w:val="000000" w:themeColor="text1"/>
+        </w:rPr>
+        <w:t>ethylmercury</w:t>
       </w:r>
     </w:p>
     <w:p>
@@ -1284,6 +1296,7 @@
   <w:style w:type="character" w:default="1" w:styleId="DefaultParagraphFont">
     <w:name w:val="Default Paragraph Font"/>
     <w:uiPriority w:val="1"/>
+    <w:semiHidden/>
     <w:unhideWhenUsed/>
   </w:style>
   <w:style w:type="table" w:default="1" w:styleId="TableNormal">

</xml_diff>